<commit_message>
feat(P4): README and Artifacts Update.
</commit_message>
<xml_diff>
--- a/04-ai-governance-and-technical-lifecycle/artifacts/A-13_Data_Governance_and_Privacy_Policy_for_AI.docx
+++ b/04-ai-governance-and-technical-lifecycle/artifacts/A-13_Data_Governance_and_Privacy_Policy_for_AI.docx
@@ -3569,6 +3569,10 @@
     <w:p>
       <w:pPr>
         <w:spacing w:after="60"/>
+        <w:rPr>
+          <w:rFonts w:ascii="Calibri" w:hAnsi="Calibri"/>
+          <w:sz w:val="19"/>
+        </w:rPr>
       </w:pPr>
       <w:r>
         <w:rPr>
@@ -3585,6 +3589,31 @@
           <w:sz w:val="19"/>
         </w:rPr>
         <w:t>The production vector store metadata schema is compared monthly via automated script against the baseline registered at Gate 2. Any unlogged divergence is treated as a security finding, not an operational variance.</w:t>
+      </w:r>
+    </w:p>
+    <w:p>
+      <w:pPr>
+        <w:spacing w:after="60"/>
+        <w:rPr>
+          <w:rFonts w:ascii="Calibri" w:hAnsi="Calibri"/>
+          <w:sz w:val="20"/>
+        </w:rPr>
+      </w:pPr>
+    </w:p>
+    <w:p>
+      <w:pPr>
+        <w:spacing w:after="60"/>
+        <w:rPr>
+          <w:rFonts w:ascii="Calibri" w:hAnsi="Calibri"/>
+          <w:sz w:val="20"/>
+        </w:rPr>
+      </w:pPr>
+      <w:r>
+        <w:rPr>
+          <w:rFonts w:ascii="Calibri" w:hAnsi="Calibri"/>
+          <w:sz w:val="20"/>
+        </w:rPr>
+        <w:t>Corpus admission is a governed change requiring joint approval by the Data Protection Officer and the Credit Risk Policy Lead, recorded in the authorised source register maintained in A-14. Ingestion of an unregistered source is a control breach.</w:t>
       </w:r>
     </w:p>
     <w:p>
@@ -3836,6 +3865,7 @@
                 <w:color w:val="1F3864"/>
                 <w:sz w:val="18"/>
               </w:rPr>
+              <w:lastRenderedPageBreak/>
               <w:t>Strict Redaction Ordering</w:t>
             </w:r>
           </w:p>
@@ -3897,7 +3927,6 @@
                 <w:color w:val="1F3864"/>
                 <w:sz w:val="18"/>
               </w:rPr>
-              <w:lastRenderedPageBreak/>
               <w:t>Data Residency Mandate</w:t>
             </w:r>
           </w:p>
@@ -4523,7 +4552,16 @@
                 <w:color w:val="000000"/>
                 <w:sz w:val="18"/>
               </w:rPr>
-              <w:t>Unconditional right to challenge automated recommendation and obtain independent review by a different credit officer.</w:t>
+              <w:t xml:space="preserve">Unconditional right to challenge automated recommendation and obtain independent review by a </w:t>
+            </w:r>
+            <w:r>
+              <w:rPr>
+                <w:rFonts w:ascii="Calibri" w:hAnsi="Calibri"/>
+                <w:color w:val="000000"/>
+                <w:sz w:val="18"/>
+              </w:rPr>
+              <w:lastRenderedPageBreak/>
+              <w:t>different credit officer.</w:t>
             </w:r>
           </w:p>
         </w:tc>
@@ -4553,6 +4591,7 @@
                 <w:color w:val="000000"/>
                 <w:sz w:val="18"/>
               </w:rPr>
+              <w:lastRenderedPageBreak/>
               <w:t>Senior Underwriter Review Queue (A-36)</w:t>
             </w:r>
           </w:p>
@@ -4645,16 +4684,7 @@
                 <w:color w:val="000000"/>
                 <w:sz w:val="18"/>
               </w:rPr>
-              <w:t xml:space="preserve">Right to correct inaccurate personal data or contested credit bureau records, triggering automated model </w:t>
-            </w:r>
-            <w:r>
-              <w:rPr>
-                <w:rFonts w:ascii="Calibri" w:hAnsi="Calibri"/>
-                <w:color w:val="000000"/>
-                <w:sz w:val="18"/>
-              </w:rPr>
-              <w:lastRenderedPageBreak/>
-              <w:t>re-scoring.</w:t>
+              <w:t>Right to correct inaccurate personal data or contested credit bureau records, triggering automated model re-scoring.</w:t>
             </w:r>
           </w:p>
         </w:tc>
@@ -4684,7 +4714,6 @@
                 <w:color w:val="000000"/>
                 <w:sz w:val="18"/>
               </w:rPr>
-              <w:lastRenderedPageBreak/>
               <w:t>Retail Credit Operations / IT</w:t>
             </w:r>
           </w:p>
@@ -5837,7 +5866,6 @@
   <w:style w:type="character" w:default="1" w:styleId="DefaultParagraphFont">
     <w:name w:val="Default Paragraph Font"/>
     <w:uiPriority w:val="1"/>
-    <w:semiHidden/>
     <w:unhideWhenUsed/>
   </w:style>
   <w:style w:type="table" w:default="1" w:styleId="TableNormal">

</xml_diff>